<commit_message>
docs(reportes): agrega seccion Detalles del Acuerdo en Reporte 1 y Reporte 0
- Reporte 1: nueva seccion '2. Detalles del Acuerdo' (roles por equipo,
  tabla de 8 sesiones quincenales + presesion, acuerdos obtenidos) y
  renumeracion de secciones subsecuentes
- Reporte 0: esqueleto de la presesion del 29-jul-2026 (pendiente de transcript)
- Registra el Reporte 0 en el indice y la navegacion (zensical.toml)
- Regenera PDF y DOCX del Reporte 1 desde el MD principal con pandoc
- Elimina los MD/TEX divergentes de las carpetas latex (ya no se usan)
- Agrega tools/build-report-downloads.sh para generar descargables
</commit_message>
<xml_diff>
--- a/docs/reports/report1-2026-08-19/latex/report1.docx
+++ b/docs/reports/report1-2026-08-19/latex/report1.docx
@@ -4,52 +4,53 @@
   <w:body>
     <w:p>
       <w:pPr>
-        <w:pStyle w:val="FirstParagraph"/>
-      </w:pPr>
-      <w:r>
-        <w:rPr>
-          <w:b/>
-          <w:bCs/>
-        </w:rPr>
-        <w:t xml:space="preserve">ABAQ</w:t>
-      </w:r>
-      <w:r>
-        <w:br/>
-      </w:r>
-      <w:r>
-        <w:t xml:space="preserve">Plataforma de Servicio Social</w:t>
-      </w:r>
-    </w:p>
-    <w:p>
-      <w:r>
-        <w:pict>
-          <v:rect style="width:0;height:1.5pt" o:hralign="center" o:hrstd="t" o:hr="t"/>
-        </w:pict>
-      </w:r>
-    </w:p>
-    <w:p>
-      <w:pPr>
-        <w:pStyle w:val="FirstParagraph"/>
-      </w:pPr>
-      <w:r>
-        <w:rPr>
-          <w:b/>
-          <w:bCs/>
-        </w:rPr>
+        <w:pStyle w:val="Title"/>
+      </w:pPr>
+      <w:r>
+        <w:t xml:space="preserve">Reporte de Avance No. 1</w:t>
+      </w:r>
+    </w:p>
+    <w:p>
+      <w:pPr>
+        <w:pStyle w:val="Author"/>
+      </w:pPr>
+      <w:r>
+        <w:t xml:space="preserve">Equipo de Desarrollo ABAQ</w:t>
+      </w:r>
+    </w:p>
+    <w:sdt>
+      <w:sdtPr>
+        <w:docPartObj>
+          <w:docPartGallery w:val="Table of Contents"/>
+          <w:docPartUnique/>
+        </w:docPartObj>
+      </w:sdtPr>
+      <w:sdtContent>
+        <w:p>
+          <w:pPr>
+            <w:pStyle w:val="TOCHeading"/>
+          </w:pPr>
+          <w:r>
+            <w:t xml:space="preserve">Table of Contents</w:t>
+          </w:r>
+        </w:p>
+        <w:p>
+          <w:r>
+            <w:fldChar w:fldCharType="begin" w:dirty="true"/>
+            <w:instrText xml:space="preserve">TOC \o "1-3" \h \z \u</w:instrText>
+            <w:fldChar w:fldCharType="separate"/>
+            <w:fldChar w:fldCharType="end"/>
+          </w:r>
+        </w:p>
+      </w:sdtContent>
+    </w:sdt>
+    <w:bookmarkStart w:id="20" w:name="_35ea0456c1c3affab2d5d38e7760bdec2045fea"/>
+    <w:p>
+      <w:pPr>
+        <w:pStyle w:val="Heading1"/>
+      </w:pPr>
+      <w:r>
         <w:t xml:space="preserve">Reporte de Avance No. 1</w:t>
-      </w:r>
-      <w:r>
-        <w:br/>
-      </w:r>
-      <w:r>
-        <w:t xml:space="preserve">Presentación inicial del prototipo y definición de requerimientos</w:t>
-      </w:r>
-    </w:p>
-    <w:p>
-      <w:r>
-        <w:pict>
-          <v:rect style="width:0;height:1.5pt" o:hralign="center" o:hrstd="t" o:hr="t"/>
-        </w:pict>
       </w:r>
     </w:p>
     <w:tbl>
@@ -68,23 +69,21 @@
           <w:p>
             <w:pPr>
               <w:pStyle w:val="Compact"/>
-              <w:jc w:val="right"/>
             </w:pPr>
             <w:r>
               <w:rPr>
                 <w:b/>
                 <w:bCs/>
               </w:rPr>
-              <w:t xml:space="preserve">Fecha:</w:t>
-            </w:r>
-          </w:p>
-        </w:tc>
-        <w:tc>
-          <w:tcPr/>
-          <w:p>
-            <w:pPr>
-              <w:pStyle w:val="Compact"/>
-              <w:jc w:val="left"/>
+              <w:t xml:space="preserve">Fecha</w:t>
+            </w:r>
+          </w:p>
+        </w:tc>
+        <w:tc>
+          <w:tcPr/>
+          <w:p>
+            <w:pPr>
+              <w:pStyle w:val="Compact"/>
             </w:pPr>
             <w:r>
               <w:t xml:space="preserve">19 de agosto de 2026</w:t>
@@ -98,23 +97,21 @@
           <w:p>
             <w:pPr>
               <w:pStyle w:val="Compact"/>
-              <w:jc w:val="right"/>
             </w:pPr>
             <w:r>
               <w:rPr>
                 <w:b/>
                 <w:bCs/>
               </w:rPr>
-              <w:t xml:space="preserve">Versión:</w:t>
-            </w:r>
-          </w:p>
-        </w:tc>
-        <w:tc>
-          <w:tcPr/>
-          <w:p>
-            <w:pPr>
-              <w:pStyle w:val="Compact"/>
-              <w:jc w:val="left"/>
+              <w:t xml:space="preserve">Versión</w:t>
+            </w:r>
+          </w:p>
+        </w:tc>
+        <w:tc>
+          <w:tcPr/>
+          <w:p>
+            <w:pPr>
+              <w:pStyle w:val="Compact"/>
             </w:pPr>
             <w:r>
               <w:t xml:space="preserve">v1.0.0</w:t>
@@ -128,23 +125,21 @@
           <w:p>
             <w:pPr>
               <w:pStyle w:val="Compact"/>
-              <w:jc w:val="right"/>
             </w:pPr>
             <w:r>
               <w:rPr>
                 <w:b/>
                 <w:bCs/>
               </w:rPr>
-              <w:t xml:space="preserve">Estado:</w:t>
-            </w:r>
-          </w:p>
-        </w:tc>
-        <w:tc>
-          <w:tcPr/>
-          <w:p>
-            <w:pPr>
-              <w:pStyle w:val="Compact"/>
-              <w:jc w:val="left"/>
+              <w:t xml:space="preserve">Estado</w:t>
+            </w:r>
+          </w:p>
+        </w:tc>
+        <w:tc>
+          <w:tcPr/>
+          <w:p>
+            <w:pPr>
+              <w:pStyle w:val="Compact"/>
             </w:pPr>
             <w:r>
               <w:t xml:space="preserve">En planeación / Prototipado</w:t>
@@ -158,23 +153,21 @@
           <w:p>
             <w:pPr>
               <w:pStyle w:val="Compact"/>
-              <w:jc w:val="right"/>
             </w:pPr>
             <w:r>
               <w:rPr>
                 <w:b/>
                 <w:bCs/>
               </w:rPr>
-              <w:t xml:space="preserve">Preparado por:</w:t>
-            </w:r>
-          </w:p>
-        </w:tc>
-        <w:tc>
-          <w:tcPr/>
-          <w:p>
-            <w:pPr>
-              <w:pStyle w:val="Compact"/>
-              <w:jc w:val="left"/>
+              <w:t xml:space="preserve">Preparado por</w:t>
+            </w:r>
+          </w:p>
+        </w:tc>
+        <w:tc>
+          <w:tcPr/>
+          <w:p>
+            <w:pPr>
+              <w:pStyle w:val="Compact"/>
             </w:pPr>
             <w:r>
               <w:t xml:space="preserve">Equipo de Desarrollo ABAQ</w:t>
@@ -184,17 +177,54 @@
       </w:tr>
     </w:tbl>
     <w:p>
-      <w:pPr>
-        <w:pStyle w:val="BodyText"/>
-      </w:pPr>
-      <w:r>
-        <w:t xml:space="preserve">Documento confidencial — Solo para uso interno del cliente</w:t>
-      </w:r>
-    </w:p>
-    <w:bookmarkStart w:id="9" w:name="resumen-ejecutivo"/>
-    <w:p>
-      <w:pPr>
-        <w:pStyle w:val="Heading1"/>
+      <w:r>
+        <w:pict>
+          <v:rect style="width:0;height:1.5pt" o:hralign="center" o:hrstd="t" o:hr="t"/>
+        </w:pict>
+      </w:r>
+    </w:p>
+    <w:p>
+      <w:pPr>
+        <w:pStyle w:val="FirstParagraph"/>
+      </w:pPr>
+      <w:r>
+        <w:rPr>
+          <w:b/>
+          <w:bCs/>
+        </w:rPr>
+        <w:t xml:space="preserve">Descargas</w:t>
+      </w:r>
+      <w:r>
+        <w:t xml:space="preserve"> </w:t>
+      </w:r>
+      <w:r>
+        <w:t xml:space="preserve">Puedes descargar este documento en los siguientes formatos:</w:t>
+      </w:r>
+    </w:p>
+    <w:p>
+      <w:pPr>
+        <w:pStyle w:val="SourceCode"/>
+      </w:pPr>
+      <w:r>
+        <w:rPr>
+          <w:rStyle w:val="VerbatimChar"/>
+        </w:rPr>
+        <w:t xml:space="preserve">-  **[Descargar PDF](latex/report1.pdf)**</w:t>
+      </w:r>
+      <w:r>
+        <w:br/>
+      </w:r>
+      <w:r>
+        <w:rPr>
+          <w:rStyle w:val="VerbatimChar"/>
+        </w:rPr>
+        <w:t xml:space="preserve">-  **[Descargar Word (.docx)](latex/report1.docx)**</w:t>
+      </w:r>
+    </w:p>
+    <w:bookmarkStart w:id="9" w:name="_56df7a16a9fe64f9452cb7ca4525fc3d95a27de"/>
+    <w:p>
+      <w:pPr>
+        <w:pStyle w:val="Heading2"/>
       </w:pPr>
       <w:r>
         <w:t xml:space="preserve">Resumen ejecutivo</w:t>
@@ -208,14 +238,21 @@
         <w:t xml:space="preserve">Este documento presenta el primer reporte de avance del proyecto ABAQ. Durante este período se llevó a cabo la presentación oficial del primer prototipo funcional de la plataforma a la asociación ABAQ Querétaro, logrando alinear las expectativas sobre el diseño y la arquitectura del sistema. Se acordó el desarrollo de un sistema con accesos separados para administradores y estudiantes, garantizando la seguridad de la información. Finalmente, se negoció un esquema de trabajo de 8 entregas quincenales para la liberación del servicio social.</w:t>
       </w:r>
     </w:p>
+    <w:p>
+      <w:r>
+        <w:pict>
+          <v:rect style="width:0;height:1.5pt" o:hralign="center" o:hrstd="t" o:hr="t"/>
+        </w:pict>
+      </w:r>
+    </w:p>
     <w:bookmarkEnd w:id="9"/>
-    <w:bookmarkStart w:id="10" w:name="introducción"/>
-    <w:p>
-      <w:pPr>
-        <w:pStyle w:val="Heading1"/>
-      </w:pPr>
-      <w:r>
-        <w:t xml:space="preserve">Introducción</w:t>
+    <w:bookmarkStart w:id="10" w:name="_introducción"/>
+    <w:p>
+      <w:pPr>
+        <w:pStyle w:val="Heading2"/>
+      </w:pPr>
+      <w:r>
+        <w:t xml:space="preserve">1. Introducción</w:t>
       </w:r>
     </w:p>
     <w:p>
@@ -226,23 +263,30 @@
         <w:t xml:space="preserve">Este documento resume los acuerdos y requerimientos recabados en la primera reunión oficial de seguimiento (19 de agosto de 2026) entre el equipo de desarrollo de software y ABAQ Querétaro. El propósito principal de la sesión fue validar el rumbo técnico del proyecto y formalizar las condiciones operativas.</w:t>
       </w:r>
     </w:p>
+    <w:p>
+      <w:r>
+        <w:pict>
+          <v:rect style="width:0;height:1.5pt" o:hralign="center" o:hrstd="t" o:hr="t"/>
+        </w:pict>
+      </w:r>
+    </w:p>
     <w:bookmarkEnd w:id="10"/>
-    <w:bookmarkStart w:id="15" w:name="cambios-en-el-servidor-backend"/>
-    <w:p>
-      <w:pPr>
-        <w:pStyle w:val="Heading1"/>
-      </w:pPr>
-      <w:r>
-        <w:t xml:space="preserve">Cambios en el Servidor (Backend)</w:t>
-      </w:r>
-    </w:p>
-    <w:bookmarkStart w:id="11" w:name="resumen-general"/>
+    <w:bookmarkStart w:id="14" w:name="_db47ea1f490a9b9a669e84238933bb89594f430"/>
     <w:p>
       <w:pPr>
         <w:pStyle w:val="Heading2"/>
       </w:pPr>
       <w:r>
-        <w:t xml:space="preserve">Resumen general</w:t>
+        <w:t xml:space="preserve">2. Detalles del Acuerdo</w:t>
+      </w:r>
+    </w:p>
+    <w:bookmarkStart w:id="11" w:name="_3d9b3078a608f8787ae59ac59a1a34ec33ae6f8"/>
+    <w:p>
+      <w:pPr>
+        <w:pStyle w:val="Heading3"/>
+      </w:pPr>
+      <w:r>
+        <w:t xml:space="preserve">2.1 Roles por equipo</w:t>
       </w:r>
     </w:p>
     <w:p>
@@ -250,64 +294,26 @@
         <w:pStyle w:val="FirstParagraph"/>
       </w:pPr>
       <w:r>
-        <w:t xml:space="preserve">En esta etapa, se definió la arquitectura base para la seguridad y separación de perfiles en la plataforma.</w:t>
-      </w:r>
-    </w:p>
-    <w:bookmarkEnd w:id="11"/>
-    <w:bookmarkStart w:id="12" w:name="protección-de-rutas-con-autenticación"/>
-    <w:p>
-      <w:pPr>
-        <w:pStyle w:val="Heading2"/>
-      </w:pPr>
-      <w:r>
-        <w:t xml:space="preserve">Protección de rutas con autenticación</w:t>
-      </w:r>
-    </w:p>
-    <w:p>
-      <w:pPr>
-        <w:pStyle w:val="FirstParagraph"/>
-      </w:pPr>
-      <w:r>
-        <w:t xml:space="preserve">Se acordó que el sistema requerirá autenticación obligatoria. El acceso de los estudiantes a módulos administrativos estará bloqueado a nivel de sistema.</w:t>
-      </w:r>
-    </w:p>
-    <w:bookmarkEnd w:id="12"/>
-    <w:bookmarkStart w:id="13" w:name="mejoras-en-la-configuración"/>
-    <w:p>
-      <w:pPr>
-        <w:pStyle w:val="Heading2"/>
-      </w:pPr>
-      <w:r>
-        <w:t xml:space="preserve">Mejoras en la configuración</w:t>
-      </w:r>
-    </w:p>
-    <w:p>
-      <w:pPr>
-        <w:pStyle w:val="FirstParagraph"/>
-      </w:pPr>
+        <w:t xml:space="preserve">El desarrollo del aplicativo está a cargo de un equipo de tres integrantes. Los tres conforman, de manera conjunta, el</w:t>
+      </w:r>
+      <w:r>
+        <w:t xml:space="preserve"> </w:t>
+      </w:r>
       <w:r>
         <w:rPr>
-          <w:i/>
-          <w:iCs/>
+          <w:b/>
+          <w:bCs/>
         </w:rPr>
-        <w:t xml:space="preserve">Pendiente por implementar / Falta de información para esta etapa.</w:t>
-      </w:r>
-    </w:p>
-    <w:bookmarkEnd w:id="13"/>
-    <w:bookmarkStart w:id="14" w:name="resumen-de-cambios-backend"/>
-    <w:p>
-      <w:pPr>
-        <w:pStyle w:val="Heading2"/>
-      </w:pPr>
-      <w:r>
-        <w:t xml:space="preserve">Resumen de cambios — Backend</w:t>
+        <w:t xml:space="preserve">equipo de base de datos del aplicativo</w:t>
+      </w:r>
+      <w:r>
+        <w:t xml:space="preserve">, responsable del modelo de datos que sustenta la plataforma.</w:t>
       </w:r>
     </w:p>
     <w:tbl>
       <w:tblPr>
         <w:tblStyle w:val="Table"/>
-        <w:tblW w:type="pct" w:w="5000"/>
-        <w:tblLayout w:type="fixed"/>
+        <w:tblW w:type="auto" w:w="0"/>
         <w:tblLook w:firstRow="1" w:lastRow="0" w:firstColumn="0" w:lastColumn="0" w:noHBand="0" w:noVBand="0" w:val="0020"/>
       </w:tblPr>
       <w:tblGrid>
@@ -325,18 +331,18 @@
               <w:pStyle w:val="Compact"/>
             </w:pPr>
             <w:r>
-              <w:t xml:space="preserve">Área</w:t>
-            </w:r>
-          </w:p>
-        </w:tc>
-        <w:tc>
-          <w:tcPr/>
-          <w:p>
-            <w:pPr>
-              <w:pStyle w:val="Compact"/>
-            </w:pPr>
-            <w:r>
-              <w:t xml:space="preserve">Descripción del cambio</w:t>
+              <w:t xml:space="preserve">Integrante</w:t>
+            </w:r>
+          </w:p>
+        </w:tc>
+        <w:tc>
+          <w:tcPr/>
+          <w:p>
+            <w:pPr>
+              <w:pStyle w:val="Compact"/>
+            </w:pPr>
+            <w:r>
+              <w:t xml:space="preserve">Rol</w:t>
             </w:r>
           </w:p>
         </w:tc>
@@ -349,18 +355,18 @@
               <w:pStyle w:val="Compact"/>
             </w:pPr>
             <w:r>
-              <w:t xml:space="preserve">Seguridad</w:t>
-            </w:r>
-          </w:p>
-        </w:tc>
-        <w:tc>
-          <w:tcPr/>
-          <w:p>
-            <w:pPr>
-              <w:pStyle w:val="Compact"/>
-            </w:pPr>
-            <w:r>
-              <w:t xml:space="preserve">Definición de separación estricta entre perfiles de Administrador y Estudiante.</w:t>
+              <w:t xml:space="preserve">Fernando Israel Ríos García</w:t>
+            </w:r>
+          </w:p>
+        </w:tc>
+        <w:tc>
+          <w:tcPr/>
+          <w:p>
+            <w:pPr>
+              <w:pStyle w:val="Compact"/>
+            </w:pPr>
+            <w:r>
+              <w:t xml:space="preserve">Documentación</w:t>
             </w:r>
           </w:p>
         </w:tc>
@@ -373,59 +379,211 @@
               <w:pStyle w:val="Compact"/>
             </w:pPr>
             <w:r>
-              <w:t xml:space="preserve">Infraestructura</w:t>
-            </w:r>
-          </w:p>
-        </w:tc>
-        <w:tc>
-          <w:tcPr/>
-          <w:p>
-            <w:pPr>
-              <w:pStyle w:val="Compact"/>
-            </w:pPr>
-            <w:r>
-              <w:t xml:space="preserve">Validación del almacenamiento en MongoDB (500 MB) como escalable y suficiente.</w:t>
+              <w:t xml:space="preserve">Johan</w:t>
+            </w:r>
+          </w:p>
+        </w:tc>
+        <w:tc>
+          <w:tcPr/>
+          <w:p>
+            <w:pPr>
+              <w:pStyle w:val="Compact"/>
+            </w:pPr>
+            <w:r>
+              <w:t xml:space="preserve">Developer general</w:t>
+            </w:r>
+          </w:p>
+        </w:tc>
+      </w:tr>
+      <w:tr>
+        <w:tc>
+          <w:tcPr/>
+          <w:p>
+            <w:pPr>
+              <w:pStyle w:val="Compact"/>
+            </w:pPr>
+            <w:r>
+              <w:t xml:space="preserve">Brahn</w:t>
+            </w:r>
+          </w:p>
+        </w:tc>
+        <w:tc>
+          <w:tcPr/>
+          <w:p>
+            <w:pPr>
+              <w:pStyle w:val="Compact"/>
+            </w:pPr>
+            <w:r>
+              <w:t xml:space="preserve">Developer y diseñador gráfico</w:t>
             </w:r>
           </w:p>
         </w:tc>
       </w:tr>
     </w:tbl>
-    <w:bookmarkEnd w:id="14"/>
-    <w:bookmarkEnd w:id="15"/>
-    <w:bookmarkStart w:id="24" w:name="cambios-en-la-aplicación-web-frontend"/>
-    <w:p>
-      <w:pPr>
-        <w:pStyle w:val="Heading1"/>
-      </w:pPr>
-      <w:r>
-        <w:t xml:space="preserve">Cambios en la Aplicación Web (Frontend)</w:t>
-      </w:r>
-    </w:p>
-    <w:bookmarkStart w:id="16" w:name="resumen-general-1"/>
-    <w:p>
-      <w:pPr>
-        <w:pStyle w:val="Heading2"/>
-      </w:pPr>
-      <w:r>
-        <w:t xml:space="preserve">Resumen general</w:t>
-      </w:r>
-    </w:p>
     <w:p>
       <w:pPr>
         <w:pStyle w:val="FirstParagraph"/>
       </w:pPr>
       <w:r>
-        <w:t xml:space="preserve">Se presentó el prototipo visual y se recogieron los requerimientos para los siguientes módulos del sistema.</w:t>
-      </w:r>
-    </w:p>
-    <w:bookmarkEnd w:id="16"/>
-    <w:bookmarkStart w:id="17" w:name="panel-de-administración"/>
-    <w:p>
-      <w:pPr>
-        <w:pStyle w:val="Heading2"/>
-      </w:pPr>
-      <w:r>
-        <w:t xml:space="preserve">Panel de Administración</w:t>
+        <w:t xml:space="preserve">El modelo de datos sobre el que trabaja este equipo está implementado en MongoDB (Mongoose) y se compone, en su estado actual, de las siguientes colecciones:</w:t>
+      </w:r>
+    </w:p>
+    <w:p>
+      <w:pPr>
+        <w:pStyle w:val="Compact"/>
+        <w:numPr>
+          <w:ilvl w:val="0"/>
+          <w:numId w:val="1001"/>
+        </w:numPr>
+      </w:pPr>
+      <w:r>
+        <w:rPr>
+          <w:b/>
+          <w:bCs/>
+        </w:rPr>
+        <w:t xml:space="preserve">Estudiante (</w:t>
+      </w:r>
+      <w:r>
+        <w:rPr>
+          <w:rStyle w:val="VerbatimChar"/>
+          <w:b/>
+          <w:bCs/>
+        </w:rPr>
+        <w:t xml:space="preserve">Student</w:t>
+      </w:r>
+      <w:r>
+        <w:rPr>
+          <w:b/>
+          <w:bCs/>
+        </w:rPr>
+        <w:t xml:space="preserve">):</w:t>
+      </w:r>
+      <w:r>
+        <w:t xml:space="preserve"> </w:t>
+      </w:r>
+      <w:r>
+        <w:t xml:space="preserve">expediente del voluntario — nombre completo, matrícula, correos personal e institucional, escuela, carrera, fecha de arranque, auditor asignado, teléfono, fecha de nacimiento, horas (a cubrir, acreditadas y pendientes), documentos oficiales (carta de aceptación, carta de término, constancia de plática), redes sociales, periodo y estado de conclusión.</w:t>
+      </w:r>
+    </w:p>
+    <w:p>
+      <w:pPr>
+        <w:pStyle w:val="Compact"/>
+        <w:numPr>
+          <w:ilvl w:val="0"/>
+          <w:numId w:val="1001"/>
+        </w:numPr>
+      </w:pPr>
+      <w:r>
+        <w:rPr>
+          <w:b/>
+          <w:bCs/>
+        </w:rPr>
+        <w:t xml:space="preserve">Contacto (</w:t>
+      </w:r>
+      <w:r>
+        <w:rPr>
+          <w:rStyle w:val="VerbatimChar"/>
+          <w:b/>
+          <w:bCs/>
+        </w:rPr>
+        <w:t xml:space="preserve">Contact</w:t>
+      </w:r>
+      <w:r>
+        <w:rPr>
+          <w:b/>
+          <w:bCs/>
+        </w:rPr>
+        <w:t xml:space="preserve">):</w:t>
+      </w:r>
+      <w:r>
+        <w:t xml:space="preserve"> </w:t>
+      </w:r>
+      <w:r>
+        <w:t xml:space="preserve">seguimiento de comunicaciones — correo de contacto, estudiante asociado, estado y fechas de seguimiento.</w:t>
+      </w:r>
+    </w:p>
+    <w:p>
+      <w:pPr>
+        <w:pStyle w:val="Compact"/>
+        <w:numPr>
+          <w:ilvl w:val="0"/>
+          <w:numId w:val="1001"/>
+        </w:numPr>
+      </w:pPr>
+      <w:r>
+        <w:rPr>
+          <w:b/>
+          <w:bCs/>
+        </w:rPr>
+        <w:t xml:space="preserve">Encuesta (</w:t>
+      </w:r>
+      <w:r>
+        <w:rPr>
+          <w:rStyle w:val="VerbatimChar"/>
+          <w:b/>
+          <w:bCs/>
+        </w:rPr>
+        <w:t xml:space="preserve">Survey</w:t>
+      </w:r>
+      <w:r>
+        <w:rPr>
+          <w:b/>
+          <w:bCs/>
+        </w:rPr>
+        <w:t xml:space="preserve">):</w:t>
+      </w:r>
+      <w:r>
+        <w:t xml:space="preserve"> </w:t>
+      </w:r>
+      <w:r>
+        <w:t xml:space="preserve">instrumento de bienestar animal — estudiante asociado, datos de mascotas, esterilización, vacunación, condiciones de vida y campos de concientización.</w:t>
+      </w:r>
+    </w:p>
+    <w:p>
+      <w:pPr>
+        <w:pStyle w:val="Compact"/>
+        <w:numPr>
+          <w:ilvl w:val="0"/>
+          <w:numId w:val="1001"/>
+        </w:numPr>
+      </w:pPr>
+      <w:r>
+        <w:rPr>
+          <w:b/>
+          <w:bCs/>
+        </w:rPr>
+        <w:t xml:space="preserve">Actividad (</w:t>
+      </w:r>
+      <w:r>
+        <w:rPr>
+          <w:rStyle w:val="VerbatimChar"/>
+          <w:b/>
+          <w:bCs/>
+        </w:rPr>
+        <w:t xml:space="preserve">Activity</w:t>
+      </w:r>
+      <w:r>
+        <w:rPr>
+          <w:b/>
+          <w:bCs/>
+        </w:rPr>
+        <w:t xml:space="preserve">):</w:t>
+      </w:r>
+      <w:r>
+        <w:t xml:space="preserve"> </w:t>
+      </w:r>
+      <w:r>
+        <w:t xml:space="preserve">actividades del servicio social — título, descripción, tipo (obligatoria, opcional o específica), fechas, valor en horas y horas validadas.</w:t>
+      </w:r>
+    </w:p>
+    <w:bookmarkEnd w:id="11"/>
+    <w:bookmarkStart w:id="12" w:name="_701d9879062212dba8c96ec42f06b997cc58dd6"/>
+    <w:p>
+      <w:pPr>
+        <w:pStyle w:val="Heading3"/>
+      </w:pPr>
+      <w:r>
+        <w:t xml:space="preserve">2.2 Fechas de entrega</w:t>
       </w:r>
     </w:p>
     <w:p>
@@ -433,123 +591,23 @@
         <w:pStyle w:val="FirstParagraph"/>
       </w:pPr>
       <w:r>
+        <w:t xml:space="preserve">Se acordó un esquema de</w:t>
+      </w:r>
+      <w:r>
+        <w:t xml:space="preserve"> </w:t>
+      </w:r>
+      <w:r>
         <w:rPr>
-          <w:i/>
-          <w:iCs/>
+          <w:b/>
+          <w:bCs/>
         </w:rPr>
-        <w:t xml:space="preserve">Pendiente. Se presentará la distinción de vistas en la próxima sesión.</w:t>
-      </w:r>
-    </w:p>
-    <w:bookmarkEnd w:id="17"/>
-    <w:bookmarkStart w:id="18" w:name="vista-de-detalle-de-estudiante"/>
-    <w:p>
-      <w:pPr>
-        <w:pStyle w:val="Heading2"/>
-      </w:pPr>
-      <w:r>
-        <w:t xml:space="preserve">Vista de Detalle de Estudiante</w:t>
-      </w:r>
-    </w:p>
-    <w:p>
-      <w:pPr>
-        <w:pStyle w:val="FirstParagraph"/>
-      </w:pPr>
-      <w:r>
-        <w:rPr>
-          <w:i/>
-          <w:iCs/>
-        </w:rPr>
-        <w:t xml:space="preserve">Falta de información / Pendiente de implementación.</w:t>
-      </w:r>
-    </w:p>
-    <w:bookmarkEnd w:id="18"/>
-    <w:bookmarkStart w:id="19" w:name="lista-de-estudiantes"/>
-    <w:p>
-      <w:pPr>
-        <w:pStyle w:val="Heading2"/>
-      </w:pPr>
-      <w:r>
-        <w:t xml:space="preserve">Lista de Estudiantes</w:t>
-      </w:r>
-    </w:p>
-    <w:p>
-      <w:pPr>
-        <w:pStyle w:val="FirstParagraph"/>
-      </w:pPr>
-      <w:r>
-        <w:rPr>
-          <w:i/>
-          <w:iCs/>
-        </w:rPr>
-        <w:t xml:space="preserve">Pendiente. Se acordó alimentar la plataforma con datos de prueba realistas para la próxima sesión.</w:t>
-      </w:r>
-    </w:p>
-    <w:bookmarkEnd w:id="19"/>
-    <w:bookmarkStart w:id="20" w:name="lista-de-actividades"/>
-    <w:p>
-      <w:pPr>
-        <w:pStyle w:val="Heading2"/>
-      </w:pPr>
-      <w:r>
-        <w:t xml:space="preserve">Lista de Actividades</w:t>
-      </w:r>
-    </w:p>
-    <w:p>
-      <w:pPr>
-        <w:pStyle w:val="FirstParagraph"/>
-      </w:pPr>
-      <w:r>
-        <w:t xml:space="preserve">Se establecieron los requerimientos para la gestión de campañas (ej. jornadas de esterilización) y el registro de asistencia con control de entradas y salidas.</w:t>
-      </w:r>
-    </w:p>
-    <w:bookmarkEnd w:id="20"/>
-    <w:bookmarkStart w:id="21" w:name="panel-del-estudiante"/>
-    <w:p>
-      <w:pPr>
-        <w:pStyle w:val="Heading2"/>
-      </w:pPr>
-      <w:r>
-        <w:t xml:space="preserve">Panel del Estudiante</w:t>
-      </w:r>
-    </w:p>
-    <w:p>
-      <w:pPr>
-        <w:pStyle w:val="FirstParagraph"/>
-      </w:pPr>
-      <w:r>
-        <w:rPr>
-          <w:i/>
-          <w:iCs/>
-        </w:rPr>
-        <w:t xml:space="preserve">Pendiente por presentar en la siguiente revisión.</w:t>
-      </w:r>
-    </w:p>
-    <w:bookmarkEnd w:id="21"/>
-    <w:bookmarkStart w:id="22" w:name="carga-de-archivos"/>
-    <w:p>
-      <w:pPr>
-        <w:pStyle w:val="Heading2"/>
-      </w:pPr>
-      <w:r>
-        <w:t xml:space="preserve">Carga de Archivos</w:t>
-      </w:r>
-    </w:p>
-    <w:p>
-      <w:pPr>
-        <w:pStyle w:val="FirstParagraph"/>
-      </w:pPr>
-      <w:r>
-        <w:t xml:space="preserve">Se solicitó la capacidad de automatizar la generación de constancias de término o cartas de participación desde el sistema de forma digital.</w:t>
-      </w:r>
-    </w:p>
-    <w:bookmarkEnd w:id="22"/>
-    <w:bookmarkStart w:id="23" w:name="resumen-de-cambios-frontend"/>
-    <w:p>
-      <w:pPr>
-        <w:pStyle w:val="Heading2"/>
-      </w:pPr>
-      <w:r>
-        <w:t xml:space="preserve">Resumen de cambios — Frontend</w:t>
+        <w:t xml:space="preserve">8 sesiones quincenales</w:t>
+      </w:r>
+      <w:r>
+        <w:t xml:space="preserve"> </w:t>
+      </w:r>
+      <w:r>
+        <w:t xml:space="preserve">(una cada 15 días) a partir de la primera sesión oficial del 19 de agosto de 2026. Se incluye además la sesión 0 correspondiente a la presesión de presentación inicial.</w:t>
       </w:r>
     </w:p>
     <w:tbl>
@@ -560,8 +618,9 @@
         <w:tblLook w:firstRow="1" w:lastRow="0" w:firstColumn="0" w:lastColumn="0" w:noHBand="0" w:noVBand="0" w:val="0020"/>
       </w:tblPr>
       <w:tblGrid>
-        <w:gridCol w:w="3960"/>
-        <w:gridCol w:w="3960"/>
+        <w:gridCol w:w="2640"/>
+        <w:gridCol w:w="2640"/>
+        <w:gridCol w:w="2640"/>
       </w:tblGrid>
       <w:tr>
         <w:trPr>
@@ -574,18 +633,29 @@
               <w:pStyle w:val="Compact"/>
             </w:pPr>
             <w:r>
-              <w:t xml:space="preserve">Área</w:t>
-            </w:r>
-          </w:p>
-        </w:tc>
-        <w:tc>
-          <w:tcPr/>
-          <w:p>
-            <w:pPr>
-              <w:pStyle w:val="Compact"/>
-            </w:pPr>
-            <w:r>
-              <w:t xml:space="preserve">Descripción del cambio</w:t>
+              <w:t xml:space="preserve">Sesión N</w:t>
+            </w:r>
+          </w:p>
+        </w:tc>
+        <w:tc>
+          <w:tcPr/>
+          <w:p>
+            <w:pPr>
+              <w:pStyle w:val="Compact"/>
+            </w:pPr>
+            <w:r>
+              <w:t xml:space="preserve">Fecha</w:t>
+            </w:r>
+          </w:p>
+        </w:tc>
+        <w:tc>
+          <w:tcPr/>
+          <w:p>
+            <w:pPr>
+              <w:pStyle w:val="Compact"/>
+            </w:pPr>
+            <w:r>
+              <w:t xml:space="preserve">Descripción</w:t>
             </w:r>
           </w:p>
         </w:tc>
@@ -598,18 +668,29 @@
               <w:pStyle w:val="Compact"/>
             </w:pPr>
             <w:r>
-              <w:t xml:space="preserve">Prototipo</w:t>
-            </w:r>
-          </w:p>
-        </w:tc>
-        <w:tc>
-          <w:tcPr/>
-          <w:p>
-            <w:pPr>
-              <w:pStyle w:val="Compact"/>
-            </w:pPr>
-            <w:r>
-              <w:t xml:space="preserve">Presentación y validación del diseño visual inicial con ABAQ Querétaro.</w:t>
+              <w:t xml:space="preserve">0</w:t>
+            </w:r>
+          </w:p>
+        </w:tc>
+        <w:tc>
+          <w:tcPr/>
+          <w:p>
+            <w:pPr>
+              <w:pStyle w:val="Compact"/>
+            </w:pPr>
+            <w:r>
+              <w:t xml:space="preserve">29 jul 2026</w:t>
+            </w:r>
+          </w:p>
+        </w:tc>
+        <w:tc>
+          <w:tcPr/>
+          <w:p>
+            <w:pPr>
+              <w:pStyle w:val="Compact"/>
+            </w:pPr>
+            <w:r>
+              <w:t xml:space="preserve">Presesión de presentación inicial (ver Reporte No. 0)</w:t>
             </w:r>
           </w:p>
         </w:tc>
@@ -622,32 +703,287 @@
               <w:pStyle w:val="Compact"/>
             </w:pPr>
             <w:r>
-              <w:t xml:space="preserve">Requerimientos</w:t>
-            </w:r>
-          </w:p>
-        </w:tc>
-        <w:tc>
-          <w:tcPr/>
-          <w:p>
-            <w:pPr>
-              <w:pStyle w:val="Compact"/>
-            </w:pPr>
-            <w:r>
-              <w:t xml:space="preserve">Definición de funcionalidades para campañas y generación de constancias.</w:t>
+              <w:t xml:space="preserve">1</w:t>
+            </w:r>
+          </w:p>
+        </w:tc>
+        <w:tc>
+          <w:tcPr/>
+          <w:p>
+            <w:pPr>
+              <w:pStyle w:val="Compact"/>
+            </w:pPr>
+            <w:r>
+              <w:t xml:space="preserve">19 ago 2026</w:t>
+            </w:r>
+          </w:p>
+        </w:tc>
+        <w:tc>
+          <w:tcPr/>
+          <w:p>
+            <w:pPr>
+              <w:pStyle w:val="Compact"/>
+            </w:pPr>
+            <w:r>
+              <w:t xml:space="preserve">Validación del prototipo y definición de requerimientos (Reporte No. 1)</w:t>
+            </w:r>
+          </w:p>
+        </w:tc>
+      </w:tr>
+      <w:tr>
+        <w:tc>
+          <w:tcPr/>
+          <w:p>
+            <w:pPr>
+              <w:pStyle w:val="Compact"/>
+            </w:pPr>
+            <w:r>
+              <w:t xml:space="preserve">2</w:t>
+            </w:r>
+          </w:p>
+        </w:tc>
+        <w:tc>
+          <w:tcPr/>
+          <w:p>
+            <w:pPr>
+              <w:pStyle w:val="Compact"/>
+            </w:pPr>
+            <w:r>
+              <w:t xml:space="preserve">2 sep 2026</w:t>
+            </w:r>
+          </w:p>
+        </w:tc>
+        <w:tc>
+          <w:tcPr/>
+          <w:p>
+            <w:pPr>
+              <w:pStyle w:val="Compact"/>
+            </w:pPr>
+            <w:r>
+              <w:t xml:space="preserve">Avance de seguridad y nuevas pantallas de administración (documentado en el Reporte No. 2, fechado el 9 sep 2026)</w:t>
+            </w:r>
+          </w:p>
+        </w:tc>
+      </w:tr>
+      <w:tr>
+        <w:tc>
+          <w:tcPr/>
+          <w:p>
+            <w:pPr>
+              <w:pStyle w:val="Compact"/>
+            </w:pPr>
+            <w:r>
+              <w:t xml:space="preserve">3</w:t>
+            </w:r>
+          </w:p>
+        </w:tc>
+        <w:tc>
+          <w:tcPr/>
+          <w:p>
+            <w:pPr>
+              <w:pStyle w:val="Compact"/>
+            </w:pPr>
+            <w:r>
+              <w:t xml:space="preserve">16 sep 2026</w:t>
+            </w:r>
+          </w:p>
+        </w:tc>
+        <w:tc>
+          <w:tcPr/>
+          <w:p>
+            <w:pPr>
+              <w:pStyle w:val="Compact"/>
+            </w:pPr>
+            <w:r>
+              <w:t xml:space="preserve">Seguimiento de desarrollo según próximos pasos acordados</w:t>
+            </w:r>
+          </w:p>
+        </w:tc>
+      </w:tr>
+      <w:tr>
+        <w:tc>
+          <w:tcPr/>
+          <w:p>
+            <w:pPr>
+              <w:pStyle w:val="Compact"/>
+            </w:pPr>
+            <w:r>
+              <w:t xml:space="preserve">4</w:t>
+            </w:r>
+          </w:p>
+        </w:tc>
+        <w:tc>
+          <w:tcPr/>
+          <w:p>
+            <w:pPr>
+              <w:pStyle w:val="Compact"/>
+            </w:pPr>
+            <w:r>
+              <w:t xml:space="preserve">30 sep 2026</w:t>
+            </w:r>
+          </w:p>
+        </w:tc>
+        <w:tc>
+          <w:tcPr/>
+          <w:p>
+            <w:pPr>
+              <w:pStyle w:val="Compact"/>
+            </w:pPr>
+            <w:r>
+              <w:t xml:space="preserve">Seguimiento de desarrollo según próximos pasos acordados</w:t>
+            </w:r>
+          </w:p>
+        </w:tc>
+      </w:tr>
+      <w:tr>
+        <w:tc>
+          <w:tcPr/>
+          <w:p>
+            <w:pPr>
+              <w:pStyle w:val="Compact"/>
+            </w:pPr>
+            <w:r>
+              <w:t xml:space="preserve">5</w:t>
+            </w:r>
+          </w:p>
+        </w:tc>
+        <w:tc>
+          <w:tcPr/>
+          <w:p>
+            <w:pPr>
+              <w:pStyle w:val="Compact"/>
+            </w:pPr>
+            <w:r>
+              <w:t xml:space="preserve">14 oct 2026</w:t>
+            </w:r>
+          </w:p>
+        </w:tc>
+        <w:tc>
+          <w:tcPr/>
+          <w:p>
+            <w:pPr>
+              <w:pStyle w:val="Compact"/>
+            </w:pPr>
+            <w:r>
+              <w:t xml:space="preserve">Seguimiento de desarrollo según próximos pasos acordados</w:t>
+            </w:r>
+          </w:p>
+        </w:tc>
+      </w:tr>
+      <w:tr>
+        <w:tc>
+          <w:tcPr/>
+          <w:p>
+            <w:pPr>
+              <w:pStyle w:val="Compact"/>
+            </w:pPr>
+            <w:r>
+              <w:t xml:space="preserve">6</w:t>
+            </w:r>
+          </w:p>
+        </w:tc>
+        <w:tc>
+          <w:tcPr/>
+          <w:p>
+            <w:pPr>
+              <w:pStyle w:val="Compact"/>
+            </w:pPr>
+            <w:r>
+              <w:t xml:space="preserve">28 oct 2026</w:t>
+            </w:r>
+          </w:p>
+        </w:tc>
+        <w:tc>
+          <w:tcPr/>
+          <w:p>
+            <w:pPr>
+              <w:pStyle w:val="Compact"/>
+            </w:pPr>
+            <w:r>
+              <w:t xml:space="preserve">Seguimiento de desarrollo según próximos pasos acordados</w:t>
+            </w:r>
+          </w:p>
+        </w:tc>
+      </w:tr>
+      <w:tr>
+        <w:tc>
+          <w:tcPr/>
+          <w:p>
+            <w:pPr>
+              <w:pStyle w:val="Compact"/>
+            </w:pPr>
+            <w:r>
+              <w:t xml:space="preserve">7</w:t>
+            </w:r>
+          </w:p>
+        </w:tc>
+        <w:tc>
+          <w:tcPr/>
+          <w:p>
+            <w:pPr>
+              <w:pStyle w:val="Compact"/>
+            </w:pPr>
+            <w:r>
+              <w:t xml:space="preserve">11 nov 2026</w:t>
+            </w:r>
+          </w:p>
+        </w:tc>
+        <w:tc>
+          <w:tcPr/>
+          <w:p>
+            <w:pPr>
+              <w:pStyle w:val="Compact"/>
+            </w:pPr>
+            <w:r>
+              <w:t xml:space="preserve">Seguimiento de desarrollo según próximos pasos acordados</w:t>
+            </w:r>
+          </w:p>
+        </w:tc>
+      </w:tr>
+      <w:tr>
+        <w:tc>
+          <w:tcPr/>
+          <w:p>
+            <w:pPr>
+              <w:pStyle w:val="Compact"/>
+            </w:pPr>
+            <w:r>
+              <w:t xml:space="preserve">8</w:t>
+            </w:r>
+          </w:p>
+        </w:tc>
+        <w:tc>
+          <w:tcPr/>
+          <w:p>
+            <w:pPr>
+              <w:pStyle w:val="Compact"/>
+            </w:pPr>
+            <w:r>
+              <w:t xml:space="preserve">25 nov 2026</w:t>
+            </w:r>
+          </w:p>
+        </w:tc>
+        <w:tc>
+          <w:tcPr/>
+          <w:p>
+            <w:pPr>
+              <w:pStyle w:val="Compact"/>
+            </w:pPr>
+            <w:r>
+              <w:t xml:space="preserve">Sesión de cierre y entrega final del sistema</w:t>
             </w:r>
           </w:p>
         </w:tc>
       </w:tr>
     </w:tbl>
-    <w:bookmarkEnd w:id="23"/>
-    <w:bookmarkEnd w:id="24"/>
-    <w:bookmarkStart w:id="27" w:name="evidencia-visual-capturas-de-pantalla"/>
-    <w:p>
-      <w:pPr>
-        <w:pStyle w:val="Heading1"/>
-      </w:pPr>
-      <w:r>
-        <w:t xml:space="preserve">Evidencia Visual — Capturas de Pantalla</w:t>
+    <w:bookmarkEnd w:id="12"/>
+    <w:bookmarkStart w:id="13" w:name="_a1dd14f5ceaa7f2834d73112abe512ecee46c8b"/>
+    <w:p>
+      <w:pPr>
+        <w:pStyle w:val="Heading3"/>
+      </w:pPr>
+      <w:r>
+        <w:t xml:space="preserve">2.3 Acuerdos obtenidos</w:t>
       </w:r>
     </w:p>
     <w:p>
@@ -655,89 +991,29 @@
         <w:pStyle w:val="FirstParagraph"/>
       </w:pPr>
       <w:r>
-        <w:rPr>
-          <w:i/>
-          <w:iCs/>
-        </w:rPr>
-        <w:t xml:space="preserve">Falta de información. Pendiente de anexar capturas oficiales de las pantallas mostradas en esta sesión.</w:t>
-      </w:r>
-    </w:p>
-    <w:p>
-      <w:pPr>
-        <w:pStyle w:val="BodyText"/>
+        <w:t xml:space="preserve">Sobre lo solicitado en la reunión, se obtuvieron los siguientes acuerdos:</w:t>
+      </w:r>
+    </w:p>
+    <w:p>
+      <w:pPr>
+        <w:pStyle w:val="Compact"/>
+        <w:numPr>
+          <w:ilvl w:val="0"/>
+          <w:numId w:val="1002"/>
+        </w:numPr>
       </w:pPr>
       <w:r>
         <w:rPr>
           <w:b/>
           <w:bCs/>
         </w:rPr>
-        <w:t xml:space="preserve">Grabación de la sesión:</w:t>
+        <w:t xml:space="preserve">Entrega del modelo de datos de voluntarios:</w:t>
       </w:r>
       <w:r>
         <w:t xml:space="preserve"> </w:t>
       </w:r>
       <w:r>
-        <w:t xml:space="preserve">-</w:t>
-      </w:r>
-      <w:r>
-        <w:t xml:space="preserve"> </w:t>
-      </w:r>
-      <w:hyperlink r:id="rId25">
-        <w:r>
-          <w:rPr>
-            <w:rStyle w:val="Hyperlink"/>
-          </w:rPr>
-          <w:t xml:space="preserve">Video de la reunión (Google Drive)</w:t>
-        </w:r>
-      </w:hyperlink>
-      <w:r>
-        <w:t xml:space="preserve"> </w:t>
-      </w:r>
-      <w:r>
-        <w:t xml:space="preserve">-</w:t>
-      </w:r>
-      <w:r>
-        <w:t xml:space="preserve"> </w:t>
-      </w:r>
-      <w:hyperlink r:id="rId26">
-        <w:r>
-          <w:rPr>
-            <w:rStyle w:val="Hyperlink"/>
-          </w:rPr>
-          <w:t xml:space="preserve">Transcripción completa</w:t>
-        </w:r>
-      </w:hyperlink>
-    </w:p>
-    <w:bookmarkEnd w:id="27"/>
-    <w:bookmarkStart w:id="28" w:name="estado-actual-del-proyecto"/>
-    <w:p>
-      <w:pPr>
-        <w:pStyle w:val="Heading1"/>
-      </w:pPr>
-      <w:r>
-        <w:t xml:space="preserve">Estado Actual del Proyecto</w:t>
-      </w:r>
-    </w:p>
-    <w:p>
-      <w:pPr>
-        <w:pStyle w:val="FirstParagraph"/>
-      </w:pPr>
-      <w:r>
-        <w:rPr>
-          <w:i/>
-          <w:iCs/>
-        </w:rPr>
-        <w:t xml:space="preserve">En Prototipado y Negociación. Se validó el prototipo funcional inicial y se acordó formalmente la liberación del servicio social a cambio de la entrega del sistema completo para diciembre de 2026.</w:t>
-      </w:r>
-    </w:p>
-    <w:bookmarkEnd w:id="28"/>
-    <w:bookmarkStart w:id="29" w:name="próximos-pasos"/>
-    <w:p>
-      <w:pPr>
-        <w:pStyle w:val="Heading1"/>
-      </w:pPr>
-      <w:r>
-        <w:t xml:space="preserve">Próximos Pasos</w:t>
+        <w:t xml:space="preserve">se entregará un archivo Excel con el modelo de datos de los voluntarios guardados en la plataforma.</w:t>
       </w:r>
     </w:p>
     <w:p>
@@ -745,7 +1021,173 @@
         <w:pStyle w:val="Compact"/>
         <w:numPr>
           <w:ilvl w:val="0"/>
-          <w:numId w:val="1001"/>
+          <w:numId w:val="1002"/>
+        </w:numPr>
+      </w:pPr>
+      <w:r>
+        <w:rPr>
+          <w:b/>
+          <w:bCs/>
+        </w:rPr>
+        <w:t xml:space="preserve">Cumplimiento de las sesiones quincenales:</w:t>
+      </w:r>
+      <w:r>
+        <w:t xml:space="preserve"> </w:t>
+      </w:r>
+      <w:r>
+        <w:t xml:space="preserve">se cumplirá con el esquema de</w:t>
+      </w:r>
+      <w:r>
+        <w:t xml:space="preserve"> </w:t>
+      </w:r>
+      <w:r>
+        <w:rPr>
+          <w:b/>
+          <w:bCs/>
+        </w:rPr>
+        <w:t xml:space="preserve">8 sesiones quincenales</w:t>
+      </w:r>
+      <w:r>
+        <w:t xml:space="preserve"> </w:t>
+      </w:r>
+      <w:r>
+        <w:t xml:space="preserve">hasta diciembre de 2026, conforme al conteo iniciado en el primer reporte (19 de agosto de 2026), culminando con la entrega del sistema completo.</w:t>
+      </w:r>
+    </w:p>
+    <w:p>
+      <w:r>
+        <w:pict>
+          <v:rect style="width:0;height:1.5pt" o:hralign="center" o:hrstd="t" o:hr="t"/>
+        </w:pict>
+      </w:r>
+    </w:p>
+    <w:bookmarkEnd w:id="13"/>
+    <w:bookmarkEnd w:id="14"/>
+    <w:bookmarkStart w:id="15" w:name="_ad7c55df36697e5a4ac1244dea2a57e5cc5ad9a"/>
+    <w:p>
+      <w:pPr>
+        <w:pStyle w:val="Heading2"/>
+      </w:pPr>
+      <w:r>
+        <w:t xml:space="preserve">3. Cambios en el Servidor (Backend)</w:t>
+      </w:r>
+    </w:p>
+    <w:p>
+      <w:pPr>
+        <w:pStyle w:val="FirstParagraph"/>
+      </w:pPr>
+      <w:r>
+        <w:t xml:space="preserve">Sin información, no requerido.</w:t>
+      </w:r>
+    </w:p>
+    <w:p>
+      <w:r>
+        <w:pict>
+          <v:rect style="width:0;height:1.5pt" o:hralign="center" o:hrstd="t" o:hr="t"/>
+        </w:pict>
+      </w:r>
+    </w:p>
+    <w:bookmarkEnd w:id="15"/>
+    <w:bookmarkStart w:id="16" w:name="_c48de7d48f096d53c17bc18a9f802f0b3af536f"/>
+    <w:p>
+      <w:pPr>
+        <w:pStyle w:val="Heading2"/>
+      </w:pPr>
+      <w:r>
+        <w:t xml:space="preserve">4. Cambios en la Aplicación Web (Frontend)</w:t>
+      </w:r>
+    </w:p>
+    <w:p>
+      <w:pPr>
+        <w:pStyle w:val="FirstParagraph"/>
+      </w:pPr>
+      <w:r>
+        <w:t xml:space="preserve">Sin información, no requerido.</w:t>
+      </w:r>
+    </w:p>
+    <w:p>
+      <w:r>
+        <w:pict>
+          <v:rect style="width:0;height:1.5pt" o:hralign="center" o:hrstd="t" o:hr="t"/>
+        </w:pict>
+      </w:r>
+    </w:p>
+    <w:bookmarkEnd w:id="16"/>
+    <w:bookmarkStart w:id="17" w:name="_b8c6bc541234fb0f85b261a1685199b7f255750"/>
+    <w:p>
+      <w:pPr>
+        <w:pStyle w:val="Heading2"/>
+      </w:pPr>
+      <w:r>
+        <w:t xml:space="preserve">5. Evidencia Visual</w:t>
+      </w:r>
+    </w:p>
+    <w:p>
+      <w:pPr>
+        <w:pStyle w:val="FirstParagraph"/>
+      </w:pPr>
+      <w:r>
+        <w:t xml:space="preserve">Falta de información.</w:t>
+      </w:r>
+    </w:p>
+    <w:p>
+      <w:r>
+        <w:pict>
+          <v:rect style="width:0;height:1.5pt" o:hralign="center" o:hrstd="t" o:hr="t"/>
+        </w:pict>
+      </w:r>
+    </w:p>
+    <w:bookmarkEnd w:id="17"/>
+    <w:bookmarkStart w:id="18" w:name="_238da3140802b3b7914224710b3e6b8d02eca33"/>
+    <w:p>
+      <w:pPr>
+        <w:pStyle w:val="Heading2"/>
+      </w:pPr>
+      <w:r>
+        <w:t xml:space="preserve">6. Estado Actual del Proyecto</w:t>
+      </w:r>
+    </w:p>
+    <w:p>
+      <w:pPr>
+        <w:pStyle w:val="FirstParagraph"/>
+      </w:pPr>
+      <w:r>
+        <w:rPr>
+          <w:b/>
+          <w:bCs/>
+        </w:rPr>
+        <w:t xml:space="preserve">En Prototipado y Negociación</w:t>
+      </w:r>
+      <w:r>
+        <w:t xml:space="preserve"> </w:t>
+      </w:r>
+      <w:r>
+        <w:t xml:space="preserve">Se validó el prototipo funcional inicial y se acordó formalmente la liberación del servicio social a cambio de la entrega del sistema completo para diciembre de 2026.</w:t>
+      </w:r>
+    </w:p>
+    <w:p>
+      <w:r>
+        <w:pict>
+          <v:rect style="width:0;height:1.5pt" o:hralign="center" o:hrstd="t" o:hr="t"/>
+        </w:pict>
+      </w:r>
+    </w:p>
+    <w:bookmarkEnd w:id="18"/>
+    <w:bookmarkStart w:id="19" w:name="_563bf2ebb134e385c8d64c69438fbcac87c24d0"/>
+    <w:p>
+      <w:pPr>
+        <w:pStyle w:val="Heading2"/>
+      </w:pPr>
+      <w:r>
+        <w:t xml:space="preserve">7. Próximos Pasos</w:t>
+      </w:r>
+    </w:p>
+    <w:p>
+      <w:pPr>
+        <w:pStyle w:val="Compact"/>
+        <w:numPr>
+          <w:ilvl w:val="0"/>
+          <w:numId w:val="1003"/>
         </w:numPr>
       </w:pPr>
       <w:r>
@@ -767,7 +1209,7 @@
         <w:pStyle w:val="Compact"/>
         <w:numPr>
           <w:ilvl w:val="0"/>
-          <w:numId w:val="1001"/>
+          <w:numId w:val="1003"/>
         </w:numPr>
       </w:pPr>
       <w:r>
@@ -789,7 +1231,7 @@
         <w:pStyle w:val="Compact"/>
         <w:numPr>
           <w:ilvl w:val="0"/>
-          <w:numId w:val="1001"/>
+          <w:numId w:val="1003"/>
         </w:numPr>
       </w:pPr>
       <w:r>
@@ -806,25 +1248,8 @@
         <w:t xml:space="preserve">Elaborar un documento formal que detalle la propuesta técnica y el calendario de entregas.</w:t>
       </w:r>
     </w:p>
-    <w:p>
-      <w:r>
-        <w:pict>
-          <v:rect style="width:0;height:1.5pt" o:hralign="center" o:hrstd="t" o:hr="t"/>
-        </w:pict>
-      </w:r>
-    </w:p>
-    <w:p>
-      <w:pPr>
-        <w:pStyle w:val="FirstParagraph"/>
-      </w:pPr>
-      <w:r>
-        <w:br/>
-      </w:r>
-      <w:r>
-        <w:t xml:space="preserve">ABAQ — Reporte de Avance No. 1 · v1.0.0 · Agosto 2026</w:t>
-      </w:r>
-    </w:p>
-    <w:bookmarkEnd w:id="29"/>
+    <w:bookmarkEnd w:id="19"/>
+    <w:bookmarkEnd w:id="20"/>
     <w:sectPr>
       <w:footnotePr>
         <w:numRestart w:val="eachSect"/>
@@ -935,6 +1360,109 @@
       </w:pPr>
     </w:lvl>
   </w:abstractNum>
+  <w:abstractNum w:abstractNumId="991">
+    <w:nsid w:val="0000A991"/>
+    <w:multiLevelType w:val="multilevel"/>
+    <w:lvl w:ilvl="0">
+      <w:numFmt w:val="bullet"/>
+      <w:lvlText w:val=""/>
+      <w:lvlJc w:val="left"/>
+      <w:pPr>
+        <w:ind w:left="720" w:hanging="360"/>
+      </w:pPr>
+      <w:rPr>
+        <w:rFonts w:ascii="Symbol" w:hAnsi="Symbol" w:cs="Symbol" w:hint="default"/>
+      </w:rPr>
+    </w:lvl>
+    <w:lvl w:ilvl="1">
+      <w:numFmt w:val="bullet"/>
+      <w:lvlText w:val="o"/>
+      <w:lvlJc w:val="left"/>
+      <w:pPr>
+        <w:ind w:left="1440" w:hanging="360"/>
+      </w:pPr>
+      <w:rPr>
+        <w:rFonts w:ascii="Courier New" w:hAnsi="Courier New" w:cs="Courier New" w:hint="default"/>
+      </w:rPr>
+    </w:lvl>
+    <w:lvl w:ilvl="2">
+      <w:numFmt w:val="bullet"/>
+      <w:lvlText w:val=""/>
+      <w:lvlJc w:val="left"/>
+      <w:pPr>
+        <w:ind w:left="2160" w:hanging="360"/>
+      </w:pPr>
+      <w:rPr>
+        <w:rFonts w:ascii="Wingdings" w:hAnsi="Wingdings" w:cs="Wingdings" w:hint="default"/>
+      </w:rPr>
+    </w:lvl>
+    <w:lvl w:ilvl="3">
+      <w:numFmt w:val="bullet"/>
+      <w:lvlText w:val=""/>
+      <w:lvlJc w:val="left"/>
+      <w:pPr>
+        <w:ind w:left="2880" w:hanging="360"/>
+      </w:pPr>
+      <w:rPr>
+        <w:rFonts w:ascii="Symbol" w:hAnsi="Symbol" w:cs="Symbol" w:hint="default"/>
+      </w:rPr>
+    </w:lvl>
+    <w:lvl w:ilvl="4">
+      <w:numFmt w:val="bullet"/>
+      <w:lvlText w:val="o"/>
+      <w:lvlJc w:val="left"/>
+      <w:pPr>
+        <w:ind w:left="3600" w:hanging="360"/>
+      </w:pPr>
+      <w:rPr>
+        <w:rFonts w:ascii="Courier New" w:hAnsi="Courier New" w:cs="Courier New" w:hint="default"/>
+      </w:rPr>
+    </w:lvl>
+    <w:lvl w:ilvl="5">
+      <w:numFmt w:val="bullet"/>
+      <w:lvlText w:val=""/>
+      <w:lvlJc w:val="left"/>
+      <w:pPr>
+        <w:ind w:left="4320" w:hanging="360"/>
+      </w:pPr>
+      <w:rPr>
+        <w:rFonts w:ascii="Wingdings" w:hAnsi="Wingdings" w:cs="Wingdings" w:hint="default"/>
+      </w:rPr>
+    </w:lvl>
+    <w:lvl w:ilvl="6">
+      <w:numFmt w:val="bullet"/>
+      <w:lvlText w:val=""/>
+      <w:lvlJc w:val="left"/>
+      <w:pPr>
+        <w:ind w:left="5040" w:hanging="360"/>
+      </w:pPr>
+      <w:rPr>
+        <w:rFonts w:ascii="Symbol" w:hAnsi="Symbol" w:cs="Symbol" w:hint="default"/>
+      </w:rPr>
+    </w:lvl>
+    <w:lvl w:ilvl="7">
+      <w:numFmt w:val="bullet"/>
+      <w:lvlText w:val="o"/>
+      <w:lvlJc w:val="left"/>
+      <w:pPr>
+        <w:ind w:left="5760" w:hanging="360"/>
+      </w:pPr>
+      <w:rPr>
+        <w:rFonts w:ascii="Courier New" w:hAnsi="Courier New" w:cs="Courier New" w:hint="default"/>
+      </w:rPr>
+    </w:lvl>
+    <w:lvl w:ilvl="8">
+      <w:numFmt w:val="bullet"/>
+      <w:lvlText w:val=""/>
+      <w:lvlJc w:val="left"/>
+      <w:pPr>
+        <w:ind w:left="6480" w:hanging="360"/>
+      </w:pPr>
+      <w:rPr>
+        <w:rFonts w:ascii="Wingdings" w:hAnsi="Wingdings" w:cs="Wingdings" w:hint="default"/>
+      </w:rPr>
+    </w:lvl>
+  </w:abstractNum>
   <w:abstractNum w:abstractNumId="99411">
     <w:nsid w:val="00A99411"/>
     <w:multiLevelType w:val="multilevel"/>
@@ -1024,6 +1552,39 @@
     <w:abstractNumId w:val="990"/>
   </w:num>
   <w:num w:numId="1001">
+    <w:abstractNumId w:val="991"/>
+  </w:num>
+  <w:num w:numId="1002">
+    <w:abstractNumId w:val="99411"/>
+    <w:lvlOverride w:ilvl="0">
+      <w:startOverride w:val="1"/>
+    </w:lvlOverride>
+    <w:lvlOverride w:ilvl="1">
+      <w:startOverride w:val="1"/>
+    </w:lvlOverride>
+    <w:lvlOverride w:ilvl="2">
+      <w:startOverride w:val="1"/>
+    </w:lvlOverride>
+    <w:lvlOverride w:ilvl="3">
+      <w:startOverride w:val="1"/>
+    </w:lvlOverride>
+    <w:lvlOverride w:ilvl="4">
+      <w:startOverride w:val="1"/>
+    </w:lvlOverride>
+    <w:lvlOverride w:ilvl="5">
+      <w:startOverride w:val="1"/>
+    </w:lvlOverride>
+    <w:lvlOverride w:ilvl="6">
+      <w:startOverride w:val="1"/>
+    </w:lvlOverride>
+    <w:lvlOverride w:ilvl="7">
+      <w:startOverride w:val="1"/>
+    </w:lvlOverride>
+    <w:lvlOverride w:ilvl="8">
+      <w:startOverride w:val="1"/>
+    </w:lvlOverride>
+  </w:num>
+  <w:num w:numId="1003">
     <w:abstractNumId w:val="99411"/>
     <w:lvlOverride w:ilvl="0">
       <w:startOverride w:val="1"/>

</xml_diff>